<commit_message>
Remove student ID from public portfolio
Remove the student number from portfolio pages, markdown evidence references, public filenames, and Word document XML so the Saramin-facing portfolio does not expose the applicant's student ID.

Constraint: The user explicitly requested all portfolio content remove the student ID before registration.

Rejected: Keeping exact evidence filenames containing the student ID | Privacy is more important than preserving local filename literals in public docs.

Confidence: high

Scope-risk: narrow

Directive: Do not reintroduce the student ID in page copy, evidence paths, filenames, or exported documents.

Tested: grep over public working tree filenames/text; docx XML scan; Python HTMLParser; unexpected control-character scan; git diff --cached --check.

Not-tested: Rendered Word document visual formatting after XML text sanitization.
</commit_message>
<xml_diff>
--- a/이윤범_로보틱스SW_포트폴리오.docx
+++ b/이윤범_로보틱스SW_포트폴리오.docx
@@ -575,7 +575,7 @@
         <w:rPr>
           <w:rStyle w:val="VerbatimChar"/>
         </w:rPr>
-        <w:t xml:space="preserve">딥러닝/2020741023_이윤범_중이염예측_보고서.docx</w:t>
+        <w:t xml:space="preserve">딥러닝/_이윤범_중이염예측_보고서.docx</w:t>
       </w:r>
       <w:r>
         <w:t xml:space="preserve">,</w:t>
@@ -723,7 +723,7 @@
         <w:rPr>
           <w:rStyle w:val="VerbatimChar"/>
         </w:rPr>
-        <w:t xml:space="preserve">컴퓨터비전/2020741023_이윤범_7주차/*.cpp</w:t>
+        <w:t xml:space="preserve">컴퓨터비전/_이윤범_7주차/*.cpp</w:t>
       </w:r>
     </w:p>
     <w:p>
@@ -991,7 +991,7 @@
         <w:rPr>
           <w:rStyle w:val="VerbatimChar"/>
         </w:rPr>
-        <w:t xml:space="preserve">강화학습/2020741023_이윤범_report.pdf</w:t>
+        <w:t xml:space="preserve">강화학습/_이윤범_report.pdf</w:t>
       </w:r>
       <w:r>
         <w:t xml:space="preserve">,</w:t>
@@ -1003,7 +1003,7 @@
         <w:rPr>
           <w:rStyle w:val="VerbatimChar"/>
         </w:rPr>
-        <w:t xml:space="preserve">강화학습/2020741023_이윤범_report_and_1_others (1).zip</w:t>
+        <w:t xml:space="preserve">강화학습/_이윤범_report_and_1_others (1).zip</w:t>
       </w:r>
     </w:p>
     <w:sectPr/>

</xml_diff>